<commit_message>
LAB3: Nhận diện và ứng phó các mối đe dọa ATTT - 1150080072 Nguyễn Văn Sang
</commit_message>
<xml_diff>
--- a/LAB3/11DH_THMT-LAB3_1150080072-NguyenVanSang.docx
+++ b/LAB3/11DH_THMT-LAB3_1150080072-NguyenVanSang.docx
@@ -263,7 +263,7 @@
                 <w:i w:val="0"/>
                 <w:sz w:val="22"/>
               </w:rPr>
-              <w:t>(lớp không yêu cầu video)</w:t>
+              <w:t>https://youtu.be/4k85o--jyFk</w:t>
             </w:r>
           </w:p>
         </w:tc>
@@ -1252,156 +1252,6 @@
                 <w:sz w:val="22"/>
               </w:rPr>
               <w:t>Capture loopback chạy, nhưng lúc curl thì HTTP server đã dừng → chỉ có SYN/RST, chưa thấy GET TRAINING_ONLY (H9). Phần HTTPS chưa làm</w:t>
-            </w:r>
-          </w:p>
-        </w:tc>
-      </w:tr>
-      <w:tr>
-        <w:tc>
-          <w:tcPr>
-            <w:tcW w:type="dxa" w:w="2835"/>
-          </w:tcPr>
-          <w:p>
-            <w:r/>
-            <w:r>
-              <w:rPr>
-                <w:b w:val="0"/>
-                <w:i w:val="0"/>
-                <w:sz w:val="22"/>
-              </w:rPr>
-              <w:t>TH6 – DoS/DDoS/Mail bombing</w:t>
-            </w:r>
-          </w:p>
-        </w:tc>
-        <w:tc>
-          <w:tcPr>
-            <w:tcW w:type="dxa" w:w="1417"/>
-          </w:tcPr>
-          <w:p>
-            <w:r/>
-            <w:r>
-              <w:rPr>
-                <w:b w:val="0"/>
-                <w:i w:val="0"/>
-                <w:sz w:val="22"/>
-              </w:rPr>
-              <w:t>CHƯA THỰC HIỆN</w:t>
-            </w:r>
-          </w:p>
-        </w:tc>
-        <w:tc>
-          <w:tcPr>
-            <w:tcW w:type="dxa" w:w="5102"/>
-          </w:tcPr>
-          <w:p>
-            <w:r/>
-            <w:r>
-              <w:rPr>
-                <w:b w:val="0"/>
-                <w:i w:val="0"/>
-                <w:sz w:val="22"/>
-              </w:rPr>
-              <w:t>Chưa làm tới phần này; câu hỏi liên quan đã trả lời trong mục C</w:t>
-            </w:r>
-          </w:p>
-        </w:tc>
-      </w:tr>
-      <w:tr>
-        <w:tc>
-          <w:tcPr>
-            <w:tcW w:type="dxa" w:w="2835"/>
-          </w:tcPr>
-          <w:p>
-            <w:r/>
-            <w:r>
-              <w:rPr>
-                <w:b w:val="0"/>
-                <w:i w:val="0"/>
-                <w:sz w:val="22"/>
-              </w:rPr>
-              <w:t>TH7 – Social Engineering/Phishing</w:t>
-            </w:r>
-          </w:p>
-        </w:tc>
-        <w:tc>
-          <w:tcPr>
-            <w:tcW w:type="dxa" w:w="1417"/>
-          </w:tcPr>
-          <w:p>
-            <w:r/>
-            <w:r>
-              <w:rPr>
-                <w:b w:val="0"/>
-                <w:i w:val="0"/>
-                <w:sz w:val="22"/>
-              </w:rPr>
-              <w:t>CHƯA THỰC HIỆN</w:t>
-            </w:r>
-          </w:p>
-        </w:tc>
-        <w:tc>
-          <w:tcPr>
-            <w:tcW w:type="dxa" w:w="5102"/>
-          </w:tcPr>
-          <w:p>
-            <w:r/>
-            <w:r>
-              <w:rPr>
-                <w:b w:val="0"/>
-                <w:i w:val="0"/>
-                <w:sz w:val="22"/>
-              </w:rPr>
-              <w:t>Chưa làm tới phần này; câu hỏi liên quan đã trả lời trong mục C</w:t>
-            </w:r>
-          </w:p>
-        </w:tc>
-      </w:tr>
-      <w:tr>
-        <w:tc>
-          <w:tcPr>
-            <w:tcW w:type="dxa" w:w="2835"/>
-          </w:tcPr>
-          <w:p>
-            <w:r/>
-            <w:r>
-              <w:rPr>
-                <w:b w:val="0"/>
-                <w:i w:val="0"/>
-                <w:sz w:val="22"/>
-              </w:rPr>
-              <w:t>Cleanup – Recover – Verify</w:t>
-            </w:r>
-          </w:p>
-        </w:tc>
-        <w:tc>
-          <w:tcPr>
-            <w:tcW w:type="dxa" w:w="1417"/>
-          </w:tcPr>
-          <w:p>
-            <w:r/>
-            <w:r>
-              <w:rPr>
-                <w:b w:val="0"/>
-                <w:i w:val="0"/>
-                <w:sz w:val="22"/>
-              </w:rPr>
-              <w:t>CHƯA THỰC HIỆN</w:t>
-            </w:r>
-          </w:p>
-        </w:tc>
-        <w:tc>
-          <w:tcPr>
-            <w:tcW w:type="dxa" w:w="5102"/>
-          </w:tcPr>
-          <w:p>
-            <w:r/>
-            <w:r>
-              <w:rPr>
-                <w:b w:val="0"/>
-                <w:i w:val="0"/>
-                <w:sz w:val="22"/>
-              </w:rPr>
-              <w:t>Chưa làm tới phần này; câu hỏi liên quan đã trả lời trong mục C</w:t>
             </w:r>
           </w:p>
         </w:tc>

</xml_diff>